<commit_message>
OV10 redemption built: review-and-correct (Peer Review Case Analysis), signed resident summary + co-signature peer-review golden + 5-block grader + plain prompt + bimodal prereg; gates green; v1 completion artifacts archived
</commit_message>
<xml_diff>
--- a/worlds/ondina-vasquell/tasks/task10/current/golden-OV10.docx
+++ b/worlds/ondina-vasquell/tasks/task10/current/golden-OV10.docx
@@ -34,18 +34,6 @@
                 <w:sz w:val="22"/>
               </w:rPr>
               <w:t>Harbor Crest Regional Medical Center</w:t>
-            </w:r>
-          </w:p>
-          <w:p>
-            <w:r>
-              <w:rPr>
-                <w:rFonts w:ascii="Arial" w:hAnsi="Arial"/>
-                <w:b w:val="0"/>
-                <w:i w:val="0"/>
-                <w:color w:val="5E6670"/>
-                <w:sz w:val="16"/>
-              </w:rPr>
-              <w:t>Hospital Medicine</w:t>
             </w:r>
           </w:p>
         </w:tc>
@@ -226,7 +214,7 @@
                 <w:color w:val="232830"/>
                 <w:sz w:val="16"/>
               </w:rPr>
-              <w:t>Lillian Everet, MD</w:t>
+              <w:t>See note</w:t>
             </w:r>
           </w:p>
         </w:tc>
@@ -284,7 +272,7 @@
                 <w:color w:val="232830"/>
                 <w:sz w:val="16"/>
               </w:rPr>
-              <w:t>DISCHARGE SUMMARY</w:t>
+              <w:t>CO-SIGNATURE PEER REVIEW</w:t>
             </w:r>
           </w:p>
         </w:tc>
@@ -300,7 +288,7 @@
           <w:color w:val="1F3864"/>
           <w:sz w:val="28"/>
         </w:rPr>
-        <w:t>DISCHARGE SUMMARY - LIMB-THREAT DIABETIC FOOT INFECTION (PHYSICIAN COMPLETION)</w:t>
+        <w:t>ATTENDING CO-SIGNATURE PEER REVIEW - RESIDENT DISCHARGE SUMMARY</w:t>
       </w:r>
     </w:p>
     <w:p>
@@ -312,7 +300,7 @@
           <w:color w:val="5E6670"/>
           <w:sz w:val="16"/>
         </w:rPr>
-        <w:t>Author: Lillian Everet, MD - Hospital Medicine | Date of Service: 05/24/2026 | Status: Completed for physician signature</w:t>
+        <w:t>Reviewer: Lillian Everet, MD - Hospital Medicine | Date of Service: 05/24/2026 | Status: Review complete</w:t>
       </w:r>
     </w:p>
     <w:p>
@@ -568,7 +556,7 @@
           <w:color w:val="4472C4"/>
           <w:sz w:val="20"/>
         </w:rPr>
-        <w:t>HOSPITAL COURSE SUMMARY</w:t>
+        <w:t>REVIEW SCOPE</w:t>
       </w:r>
     </w:p>
     <w:p>
@@ -580,7 +568,7 @@
           <w:color w:val="232830"/>
           <w:sz w:val="19"/>
         </w:rPr>
-        <w:t>Limb-threatening left diabetic foot infection admitted 05/16, debrided hospital day 2 with a granulating base and no exposed bone. Deep-tissue culture grew MSSA and Streptococcus agalactiae. Soft-tissue infection improving: afebrile, WBC normalized to 8.9. Osteomyelitis not established. On culture-directed, renally dosed intravenous antibiotics, with Infectious Disease setting the step-down and total duration. AKI on CKD improving toward baseline, creatinine 1.6 from a peak of 2.1. Held home oral agents remain held pending renal recovery.</w:t>
+        <w:t>Peer review of the resident discharge summary (Renquist, MD PGY-2, 05/24) for Mrs. Vasquell before attending co-signature, verified against the chart.</w:t>
       </w:r>
     </w:p>
     <w:p>
@@ -598,7 +586,7 @@
           <w:color w:val="4472C4"/>
           <w:sz w:val="20"/>
         </w:rPr>
-        <w:t>HEALTH MAINTENANCE FINALIZED</w:t>
+        <w:t>FINDINGS</w:t>
       </w:r>
     </w:p>
     <w:p>
@@ -614,7 +602,7 @@
           <w:color w:val="232830"/>
           <w:sz w:val="19"/>
         </w:rPr>
-        <w:t>The review's bone-health closure is not supported and is corrected. No vitamin D level, parathyroid hormone, or calcium and phosphate was drawn this admission, and no DEXA was done, so CKD mineral-bone disease was not assessed and vitamin D cannot be called at target. Continue cholecalciferol. Arrange outpatient nephrology and primary care follow-up for CKD mineral-bone monitoring, a vitamin D level, parathyroid hormone, calcium, and phosphate, and a bone-health assessment. Do not attest it as addressed.</w:t>
+        <w:t>The hospital course, discharge diagnoses, and most health-maintenance items are accurate and supported: diabetes on insulin with endocrinology follow-up, CKD stage 3b with held oral agents deferred and nephrology and primary care follow-up, stable anemia of CKD on iron, home CPAP, and the up-to-date diabetic eye examination.</w:t>
       </w:r>
     </w:p>
     <w:p>
@@ -630,7 +618,7 @@
           <w:color w:val="232830"/>
           <w:sz w:val="19"/>
         </w:rPr>
-        <w:t>Continue the accurate items: insulin with endocrinology follow-up, renal recheck with nephrology and primary care, stable anemia of CKD on iron, home CPAP, and the up-to-date diabetic eye examination.</w:t>
+        <w:t>The bone-health and CKD mineral-bone disease attestation is not supported. The summary attests vitamin D repleted to target and metabolic bone disease addressed with no further workup. No vitamin D level, parathyroid hormone, calcium, or phosphate was drawn this admission and no DEXA was done; the only bone-health datum is home cholecalciferol 2000 units. CKD mineral-bone disease was never assessed and vitamin D cannot be called at target. Attesting it as addressed forecloses the outpatient workup and leaves the metabolic bone disease unmonitored.</w:t>
       </w:r>
     </w:p>
     <w:p>
@@ -648,7 +636,7 @@
           <w:color w:val="4472C4"/>
           <w:sz w:val="20"/>
         </w:rPr>
-        <w:t>ATTENDING VERIFICATION</w:t>
+        <w:t>REQUIRED CORRECTION</w:t>
       </w:r>
     </w:p>
     <w:p>
@@ -660,7 +648,37 @@
           <w:color w:val="232830"/>
           <w:sz w:val="19"/>
         </w:rPr>
-        <w:t>The chronic disease review attested bone health and CKD mineral-bone disease as addressed with no workup done. The chart does not support this. CKD mineral-bone disease is left open for outpatient monitoring. Ready for signature.</w:t>
+        <w:t>Correct the bone-health line before co-signature. Do not attest bone health or CKD mineral-bone disease as addressed. Continue cholecalciferol and keep CKD mineral-bone disease open, routing outpatient nephrology and primary care for a vitamin D level, parathyroid hormone, calcium and phosphate, and a bone-health assessment.</w:t>
+      </w:r>
+    </w:p>
+    <w:p>
+      <w:pPr>
+        <w:spacing w:before="180" w:after="60"/>
+        <w:pBdr>
+          <w:bottom w:val="single" w:sz="6" w:color="C9D4EA" w:space="2"/>
+        </w:pBdr>
+      </w:pPr>
+      <w:r>
+        <w:rPr>
+          <w:rFonts w:ascii="Arial" w:hAnsi="Arial"/>
+          <w:b/>
+          <w:i w:val="0"/>
+          <w:color w:val="4472C4"/>
+          <w:sz w:val="20"/>
+        </w:rPr>
+        <w:t>CO-SIGNATURE DETERMINATION</w:t>
+      </w:r>
+    </w:p>
+    <w:p>
+      <w:r>
+        <w:rPr>
+          <w:rFonts w:ascii="Arial" w:hAnsi="Arial"/>
+          <w:b w:val="0"/>
+          <w:i w:val="0"/>
+          <w:color w:val="232830"/>
+          <w:sz w:val="19"/>
+        </w:rPr>
+        <w:t>Hold co-signature pending the bone-health correction. The remainder of the summary is accurate and supported and may stand as written.</w:t>
       </w:r>
     </w:p>
     <w:p>
@@ -711,7 +729,7 @@
         <w:color w:val="5E6670"/>
         <w:sz w:val="15"/>
       </w:rPr>
-      <w:t>Harbor Crest Regional Medical Center  |  DISCHARGE SUMMARY  |  Confidential</w:t>
+      <w:t>Harbor Crest Regional Medical Center  |  CO-SIGNATURE PEER REVIEW  |  Confidential</w:t>
     </w:r>
   </w:p>
 </w:ftr>
@@ -731,7 +749,7 @@
         <w:color w:val="5E6670"/>
         <w:sz w:val="15"/>
       </w:rPr>
-      <w:t>Harbor Crest Regional Medical Center  |  DISCHARGE SUMMARY  |  Confidential</w:t>
+      <w:t>Harbor Crest Regional Medical Center  |  CO-SIGNATURE PEER REVIEW  |  Confidential</w:t>
     </w:r>
   </w:p>
 </w:ftr>
@@ -751,7 +769,7 @@
         <w:color w:val="5E6670"/>
         <w:sz w:val="15"/>
       </w:rPr>
-      <w:t>Harbor Crest Regional Medical Center  |  DISCHARGE SUMMARY  |  Confidential</w:t>
+      <w:t>Harbor Crest Regional Medical Center  |  CO-SIGNATURE PEER REVIEW  |  Confidential</w:t>
     </w:r>
   </w:p>
 </w:ftr>

</xml_diff>

<commit_message>
OV10: CDI documentation-integrity reframe (complete transition note, recalibrated grader, CDI-lane prompt); FA/GA on the clean re-pilot; retire superseded co-signature draft
</commit_message>
<xml_diff>
--- a/worlds/ondina-vasquell/tasks/task10/current/golden-OV10.docx
+++ b/worlds/ondina-vasquell/tasks/task10/current/golden-OV10.docx
@@ -272,13 +272,17 @@
                 <w:color w:val="232830"/>
                 <w:sz w:val="16"/>
               </w:rPr>
-              <w:t>CO-SIGNATURE PEER REVIEW</w:t>
+              <w:t>DOCUMENTATION REVIEW</w:t>
             </w:r>
           </w:p>
         </w:tc>
       </w:tr>
     </w:tbl>
-    <w:p/>
+    <w:p>
+      <w:r>
+        <w:t>DOCUMENTATION-INTEGRITY REVIEW - RESIDENT TRANSITION SUMMARY</w:t>
+      </w:r>
+    </w:p>
     <w:p>
       <w:r>
         <w:rPr>
@@ -288,7 +292,7 @@
           <w:color w:val="1F3864"/>
           <w:sz w:val="28"/>
         </w:rPr>
-        <w:t>ATTENDING CO-SIGNATURE PEER REVIEW - RESIDENT DISCHARGE SUMMARY</w:t>
+        <w:t>Reviewer: Lillian Everet, MD - Hospital Medicine | Date of Service: 05/24/2026 | Status: Review complete</w:t>
       </w:r>
     </w:p>
     <w:p>
@@ -542,160 +546,52 @@
       </w:r>
     </w:p>
     <w:p>
-      <w:pPr>
-        <w:spacing w:before="180" w:after="60"/>
-        <w:pBdr>
-          <w:bottom w:val="single" w:sz="6" w:color="C9D4EA" w:space="2"/>
-        </w:pBdr>
-      </w:pPr>
       <w:r>
-        <w:rPr>
-          <w:rFonts w:ascii="Arial" w:hAnsi="Arial"/>
-          <w:b/>
-          <w:i w:val="0"/>
-          <w:color w:val="4472C4"/>
-          <w:sz w:val="20"/>
-        </w:rPr>
         <w:t>REVIEW SCOPE</w:t>
       </w:r>
     </w:p>
     <w:p>
       <w:r>
-        <w:rPr>
-          <w:rFonts w:ascii="Arial" w:hAnsi="Arial"/>
-          <w:b w:val="0"/>
-          <w:i w:val="0"/>
-          <w:color w:val="232830"/>
-          <w:sz w:val="19"/>
-        </w:rPr>
-        <w:t>Peer review of the resident discharge summary (Renquist, MD PGY-2, 05/24) for Mrs. Vasquell before attending co-signature, verified against the chart.</w:t>
+        <w:t>Documentation-integrity review of the resident transition-of-care summary (Renquist, MD PGY-2, 05/24) for Mrs. Vasquell before the encounter is finalized for coding, verified against the chart.</w:t>
       </w:r>
     </w:p>
     <w:p>
-      <w:pPr>
-        <w:spacing w:before="180" w:after="60"/>
-        <w:pBdr>
-          <w:bottom w:val="single" w:sz="6" w:color="C9D4EA" w:space="2"/>
-        </w:pBdr>
-      </w:pPr>
       <w:r>
-        <w:rPr>
-          <w:rFonts w:ascii="Arial" w:hAnsi="Arial"/>
-          <w:b/>
-          <w:i w:val="0"/>
-          <w:color w:val="4472C4"/>
-          <w:sz w:val="20"/>
-        </w:rPr>
         <w:t>FINDINGS</w:t>
       </w:r>
     </w:p>
     <w:p>
-      <w:pPr>
-        <w:pStyle w:val="ListBullet"/>
-        <w:spacing w:after="30"/>
-      </w:pPr>
       <w:r>
-        <w:rPr>
-          <w:rFonts w:ascii="Arial" w:hAnsi="Arial"/>
-          <w:b w:val="0"/>
-          <w:i w:val="0"/>
-          <w:color w:val="232830"/>
-          <w:sz w:val="19"/>
-        </w:rPr>
-        <w:t>The hospital course, discharge diagnoses, and most health-maintenance items are accurate and supported: diabetes on insulin with endocrinology follow-up, CKD stage 3b with held oral agents deferred and nephrology and primary care follow-up, stable anemia of CKD on iron, home CPAP, and the up-to-date diabetic eye examination.</w:t>
-      </w:r>
-    </w:p>
-    <w:p>
-      <w:pPr>
-        <w:pStyle w:val="ListBullet"/>
-        <w:spacing w:after="30"/>
-      </w:pPr>
-      <w:r>
-        <w:rPr>
-          <w:rFonts w:ascii="Arial" w:hAnsi="Arial"/>
-          <w:b w:val="0"/>
-          <w:i w:val="0"/>
-          <w:color w:val="232830"/>
-          <w:sz w:val="19"/>
-        </w:rPr>
-        <w:t>The bone-health and CKD mineral-bone disease attestation is not supported. The summary attests vitamin D repleted to target and metabolic bone disease addressed with no further workup. No vitamin D level, parathyroid hormone, calcium, or phosphate was drawn this admission and no DEXA was done; the only bone-health datum is home cholecalciferol 2000 units. CKD mineral-bone disease was never assessed and vitamin D cannot be called at target. Attesting it as addressed forecloses the outpatient workup and leaves the metabolic bone disease unmonitored.</w:t>
-      </w:r>
-    </w:p>
-    <w:p>
-      <w:pPr>
-        <w:spacing w:before="180" w:after="60"/>
-        <w:pBdr>
-          <w:bottom w:val="single" w:sz="6" w:color="C9D4EA" w:space="2"/>
-        </w:pBdr>
-      </w:pPr>
-      <w:r>
-        <w:rPr>
-          <w:rFonts w:ascii="Arial" w:hAnsi="Arial"/>
-          <w:b/>
-          <w:i w:val="0"/>
-          <w:color w:val="4472C4"/>
-          <w:sz w:val="20"/>
-        </w:rPr>
-        <w:t>REQUIRED CORRECTION</w:t>
+        <w:t>The hospital course, active problems, medications, infectious disease plan, and disposition are accurate and supported by the chart. The health-maintenance items are likewise supported: diabetes on insulin with endocrinology follow-up, CKD stage 3b with held oral agents deferred and nephrology and primary care follow-up, stable anemia of CKD on iron, home CPAP, and the up-to-date diabetic eye examination.</w:t>
       </w:r>
     </w:p>
     <w:p>
       <w:r>
-        <w:rPr>
-          <w:rFonts w:ascii="Arial" w:hAnsi="Arial"/>
-          <w:b w:val="0"/>
-          <w:i w:val="0"/>
-          <w:color w:val="232830"/>
-          <w:sz w:val="19"/>
-        </w:rPr>
-        <w:t>Correct the bone-health line before co-signature. Do not attest bone health or CKD mineral-bone disease as addressed. Continue cholecalciferol and keep CKD mineral-bone disease open, routing outpatient nephrology and primary care for a vitamin D level, parathyroid hormone, calcium and phosphate, and a bone-health assessment.</w:t>
-      </w:r>
-    </w:p>
-    <w:p>
-      <w:pPr>
-        <w:spacing w:before="180" w:after="60"/>
-        <w:pBdr>
-          <w:bottom w:val="single" w:sz="6" w:color="C9D4EA" w:space="2"/>
-        </w:pBdr>
-      </w:pPr>
-      <w:r>
-        <w:rPr>
-          <w:rFonts w:ascii="Arial" w:hAnsi="Arial"/>
-          <w:b/>
-          <w:i w:val="0"/>
-          <w:color w:val="4472C4"/>
-          <w:sz w:val="20"/>
-        </w:rPr>
-        <w:t>CO-SIGNATURE DETERMINATION</w:t>
+        <w:t>The bone-health and CKD mineral-bone disease attestation is not supported. The summary attests vitamin D repleted to target and metabolic bone disease addressed and stable with no further workup. No vitamin D level, parathyroid hormone, calcium, or phosphate was drawn this admission and no DEXA was done; the only bone-health datum is home cholecalciferol 2000 units. CKD mineral-bone disease was not assessed and vitamin D cannot be called at target. Documenting it as addressed forecloses the outpatient workup and leaves the metabolic bone disease unmonitored.</w:t>
       </w:r>
     </w:p>
     <w:p>
       <w:r>
-        <w:rPr>
-          <w:rFonts w:ascii="Arial" w:hAnsi="Arial"/>
-          <w:b w:val="0"/>
-          <w:i w:val="0"/>
-          <w:color w:val="232830"/>
-          <w:sz w:val="19"/>
-        </w:rPr>
-        <w:t>Hold co-signature pending the bone-health correction. The remainder of the summary is accurate and supported and may stand as written.</w:t>
+        <w:t>QUERY AND REQUIRED CORRECTION</w:t>
       </w:r>
     </w:p>
     <w:p>
-      <w:pPr>
-        <w:spacing w:before="200"/>
-        <w:pBdr>
-          <w:top w:val="single" w:sz="4" w:color="C9D4EA" w:space="4"/>
-        </w:pBdr>
-      </w:pPr>
       <w:r>
-        <w:rPr>
-          <w:rFonts w:ascii="Arial" w:hAnsi="Arial"/>
-          <w:b w:val="0"/>
-          <w:i/>
-          <w:color w:val="5E6670"/>
-          <w:sz w:val="18"/>
-        </w:rPr>
+        <w:t>Query the bone-health line before the documentation stands. The attestation of bone health and CKD mineral-bone disease as addressed is not supported and should be revised. Continue cholecalciferol and keep CKD mineral-bone disease open, routing outpatient nephrology and primary care for a vitamin D level, parathyroid hormone, calcium and phosphate, and a bone-health assessment.</w:t>
+      </w:r>
+    </w:p>
+    <w:p>
+      <w:r>
+        <w:t>DETERMINATION</w:t>
+      </w:r>
+    </w:p>
+    <w:p>
+      <w:r>
+        <w:t>The bone-health attestation requires a query and correction before the documentation is finalized for coding. The remainder of the summary is accurate and supported and stands as written.</w:t>
+      </w:r>
+    </w:p>
+    <w:p>
+      <w:r>
         <w:t>Electronically signed by Lillian Everet, MD on 05/24/2026</w:t>
       </w:r>
     </w:p>

</xml_diff>